<commit_message>
Add customer range and top-N order selection; explicit BAPI clears
Selection screen: optional customer (sold-to) range S_KUNNR and
obligatory 'orders to check' P_TOPN (default 1). Without customers the
top-N highest-value orders of the period are replicated; with a
customer range the top-N orders are determined per customer (e.g. 5
customers x 5 = 25 copy orders per run). Added Customer column to the
ALV and per-customer sort. All BAPI input/output structures and tables
are cleared explicitly at the start of each order so no values carry
over between orders of one run. TSD and user guide updated.

Co-Authored-By: Claude Fable 5 <noreply@anthropic.com>
Claude-Session: https://claude.ai/code/session_01LKCMPMcwtUMr1Kqkg3AKpb
</commit_message>
<xml_diff>
--- a/ZSD_PRICING_COMPARE_User_Guide.docx
+++ b/ZSD_PRICING_COMPARE_User_Guide.docx
@@ -416,7 +416,7 @@
           <w:sz w:val="22"/>
           <w:szCs w:val="22"/>
         </w:rPr>
-        <w:t xml:space="preserve">You only enter two things on the selection screen: a sales document type and a date range. Everything else is automatic:</w:t>
+        <w:t xml:space="preserve">You enter a sales document type and a date range (mandatory). Optionally you can enter a customer range and how many orders to check (default 1). Everything else is automatic:</w:t>
       </w:r>
     </w:p>
     <w:p>
@@ -433,7 +433,7 @@
           <w:sz w:val="22"/>
           <w:szCs w:val="22"/>
         </w:rPr>
-        <w:t xml:space="preserve">The program searches all sales orders of that document type created in that period and picks the order with the highest net value. This order is called the </w:t>
+        <w:t xml:space="preserve">The program searches all sales orders of that document type created in that period and picks the orders with the highest net value — as many as you asked for in “How many orders to check”. Each selected order is called an </w:t>
       </w:r>
       <w:r>
         <w:rPr>
@@ -449,7 +449,7 @@
           <w:sz w:val="22"/>
           <w:szCs w:val="22"/>
         </w:rPr>
-        <w:t xml:space="preserve"> — it still carries the prices calculated by ECC.</w:t>
+        <w:t xml:space="preserve"> — it still carries the prices calculated by ECC. If you also enter customers, the highest-value orders are determined per customer: for example 5 customers and “check 5 orders” means 5 × 5 = 25 orders are checked in one run.</w:t>
       </w:r>
     </w:p>
     <w:p>
@@ -645,7 +645,24 @@
           <w:sz w:val="22"/>
           <w:szCs w:val="22"/>
         </w:rPr>
-        <w:t xml:space="preserve">Press Execute (F8). The program runs for a few seconds and shows the comparison report.</w:t>
+        <w:t xml:space="preserve">Optional: enter a Customer range to check specific customers, and set “How many orders to check” (default 1). With customers entered, that many top orders are checked per customer.</w:t>
+      </w:r>
+    </w:p>
+    <w:p>
+      <w:pPr>
+        <w:pStyle w:val="ListParagraph"/>
+        <w:numPr>
+          <w:ilvl w:val="0"/>
+          <w:numId w:val="3"/>
+        </w:numPr>
+        <w:spacing w:after="80"/>
+      </w:pPr>
+      <w:r>
+        <w:rPr>
+          <w:sz w:val="22"/>
+          <w:szCs w:val="22"/>
+        </w:rPr>
+        <w:t xml:space="preserve">Press Execute (F8). The program runs and shows the comparison report.</w:t>
       </w:r>
     </w:p>
     <w:p>
@@ -657,7 +674,7 @@
           <w:sz w:val="22"/>
           <w:szCs w:val="22"/>
         </w:rPr>
-        <w:t xml:space="preserve">The header of the report tells you which order was selected as the highest-value order of the period, and summarises how many conditions were OK, different, or missing.</w:t>
+        <w:t xml:space="preserve">The header of the report tells you how many orders were selected, and summarises how many conditions were OK, different, or missing. A Customer column shows the sold-to party of every row.</w:t>
       </w:r>
     </w:p>
     <w:p>
@@ -2061,7 +2078,7 @@
           <w:sz w:val="22"/>
           <w:szCs w:val="22"/>
         </w:rPr>
-        <w:t xml:space="preserve">One order (the highest-value one of the period) is checked per run. To validate broadly, run the program once per document type and per period (e.g. month by month).</w:t>
+        <w:t xml:space="preserve">The number of orders checked per run is controlled by “How many orders to check” (default 1) — overall, or per customer when a customer range is entered. To validate broadly, vary document type, period and customers across runs.</w:t>
       </w:r>
     </w:p>
     <w:p>

</xml_diff>

<commit_message>
Add mode R2: compare user-specified sales orders
New radio buttons: R1 (default) keeps the automatic top-N selection;
R2 lets the user enter specific sales order numbers (multiple
selection) - each listed order is copied and compared. Mandatory
fields validated per mode at runtime: R1 needs document type + date
range (+ orders-to-check >= 1), R2 needs at least one order number.
TSD and user guide updated.

Co-Authored-By: Claude Fable 5 <noreply@anthropic.com>
Claude-Session: https://claude.ai/code/session_01LKCMPMcwtUMr1Kqkg3AKpb
</commit_message>
<xml_diff>
--- a/ZSD_PRICING_COMPARE_User_Guide.docx
+++ b/ZSD_PRICING_COMPARE_User_Guide.docx
@@ -416,7 +416,7 @@
           <w:sz w:val="22"/>
           <w:szCs w:val="22"/>
         </w:rPr>
-        <w:t xml:space="preserve">You enter a sales document type and a date range (mandatory). Optionally you can enter a customer range and how many orders to check (default 1). Everything else is automatic:</w:t>
+        <w:t xml:space="preserve">The selection screen offers two modes. In the automatic mode (default) you enter a sales document type and a date range (mandatory), optionally a customer range and how many orders to check (default 1). In the second mode you simply enter specific sales order numbers yourself — each listed order is copied and compared. In automatic mode everything else is automatic:</w:t>
       </w:r>
     </w:p>
     <w:p>
@@ -646,6 +646,23 @@
           <w:szCs w:val="22"/>
         </w:rPr>
         <w:t xml:space="preserve">Optional: enter a Customer range to check specific customers, and set “How many orders to check” (default 1). With customers entered, that many top orders are checked per customer.</w:t>
+      </w:r>
+    </w:p>
+    <w:p>
+      <w:pPr>
+        <w:pStyle w:val="ListParagraph"/>
+        <w:numPr>
+          <w:ilvl w:val="0"/>
+          <w:numId w:val="3"/>
+        </w:numPr>
+        <w:spacing w:after="80"/>
+      </w:pPr>
+      <w:r>
+        <w:rPr>
+          <w:sz w:val="22"/>
+          <w:szCs w:val="22"/>
+        </w:rPr>
+        <w:t xml:space="preserve">Alternative: choose the second radio button “Specific sales orders” and enter the order numbers you want to check yourself — then document type and date range are not needed.</w:t>
       </w:r>
     </w:p>
     <w:p>

</xml_diff>

<commit_message>
Compare VBAP/VBAK value fields; two-screen ALV with order verdict
Customer requirement: compare stored value fields between the
migrated ECC order X and the freshly priced copy Y - VBAP NETWR,
NETPR, SKTOF, WAVWR, KZWI1-KZWI6, MWSBP per item and VBAK NETWR at
header level. Amount fields TCURX-converted, non-amount fields
compared raw.

Output redesigned as a two-screen drill-down: screen 1 shows one row
per order with net values, check counters and an ALL OK / CHECK /
ERROR verdict plus an overall RESULT line in the header; double-click
opens screen 2, a popup ALV with the full condition- and field-level
comparison of that order. TSD and user guide updated.

Co-Authored-By: Claude Fable 5 <noreply@anthropic.com>
Claude-Session: https://claude.ai/code/session_01LKCMPMcwtUMr1Kqkg3AKpb
</commit_message>
<xml_diff>
--- a/ZSD_PRICING_COMPARE_User_Guide.docx
+++ b/ZSD_PRICING_COMPARE_User_Guide.docx
@@ -516,7 +516,7 @@
           <w:sz w:val="22"/>
           <w:szCs w:val="22"/>
         </w:rPr>
-        <w:t xml:space="preserve">The program compares the two orders line by line: every pricing condition (price, discount, surcharge, tax) of the old order against the same condition of the new order — rate, pricing unit, unit of measure, condition value, and the net value of every item.</w:t>
+        <w:t xml:space="preserve">The program compares the two orders line by line: every pricing condition (price, discount, surcharge, tax) of the old order against the same condition of the new order — rate, pricing unit, unit of measure, condition value — plus the stored value fields per item (net value, net price, cost, subtotals 1–6, tax amount, cash-discount flag) and the order header net value.</w:t>
       </w:r>
     </w:p>
     <w:p>
@@ -533,7 +533,7 @@
           <w:sz w:val="22"/>
           <w:szCs w:val="22"/>
         </w:rPr>
-        <w:t xml:space="preserve">The result is shown as a color-coded list. Green means identical, yellow means a harmless difference, red means the S/4HANA pricing does not reproduce the ECC result and must be investigated.</w:t>
+        <w:t xml:space="preserve">The result is shown on two screens. The first screen has one row per order with a clear verdict: ALL OK (green) when everything matches, CHECK (red) when there are differences, ERROR (red) when the copy could not be created. Double-clicking an order row opens the detailed pricing comparison for that order.</w:t>
       </w:r>
     </w:p>
     <w:p>
@@ -691,7 +691,7 @@
           <w:sz w:val="22"/>
           <w:szCs w:val="22"/>
         </w:rPr>
-        <w:t xml:space="preserve">The header of the report tells you how many orders were selected, and summarises how many conditions were OK, different, or missing. A Customer column shows the sold-to party of every row.</w:t>
+        <w:t xml:space="preserve">The first screen shows one row per checked order with the verdict (ALL OK / CHECK / ERROR), the old and new net values, and the number of checks passed. The header line answers the key question at a glance: "RESULT: ALL OK" or "RESULT: N differences". Double-click any order row to open the detailed condition-by-condition comparison for that order.</w:t>
       </w:r>
     </w:p>
     <w:p>

</xml_diff>

<commit_message>
Update customer user guide for final UI
Documents the dynamic selection screen, the clickable order-number
hotspot, the two-screen output (overview verdict + detail popup with
Section/Description columns, separated rates and amounts, pricing
date), the VBAP/VBAK field checks and the VK13 double-click jump.

Co-Authored-By: Claude Fable 5 <noreply@anthropic.com>
Claude-Session: https://claude.ai/code/session_01LKCMPMcwtUMr1Kqkg3AKpb
</commit_message>
<xml_diff>
--- a/ZSD_PRICING_COMPARE_User_Guide.docx
+++ b/ZSD_PRICING_COMPARE_User_Guide.docx
@@ -691,7 +691,7 @@
           <w:sz w:val="22"/>
           <w:szCs w:val="22"/>
         </w:rPr>
-        <w:t xml:space="preserve">The first screen shows one row per checked order with the verdict (ALL OK / CHECK / ERROR), the old and new net values, and the number of checks passed. The header line answers the key question at a glance: "RESULT: ALL OK" or "RESULT: N differences". Double-click any order row to open the detailed condition-by-condition comparison for that order.</w:t>
+        <w:t xml:space="preserve">The selection screen adapts to your choice: only the fields of the chosen mode are shown, and the mandatory ones carry the required-entry indicator. After execution, the first screen shows one row per checked order with the verdict (ALL OK / CHECK / ERROR), the old and new net values, and the number of checks passed. The header line answers the key question at a glance: "RESULT: ALL OK" or "RESULT: N differences". The order number is shown as a clickable link — click it (or double-click the row) to open the detailed pricing comparison for that order.</w:t>
       </w:r>
     </w:p>
     <w:p>
@@ -739,7 +739,7 @@
           <w:sz w:val="24"/>
           <w:szCs w:val="24"/>
         </w:rPr>
-        <w:t xml:space="preserve">4.1 Columns</w:t>
+        <w:t xml:space="preserve">4.1 Screen 1 — Order overview (one row per order)</w:t>
       </w:r>
     </w:p>
     <w:tbl>
@@ -855,7 +855,7 @@
                 <w:sz w:val="20"/>
                 <w:szCs w:val="20"/>
               </w:rPr>
-              <w:t xml:space="preserve">The migrated order (X) with the original ECC prices</w:t>
+              <w:t xml:space="preserve">The migrated order (X) with the original ECC prices — clickable link that opens the detail screen</w:t>
             </w:r>
           </w:p>
         </w:tc>
@@ -928,7 +928,7 @@
                 <w:sz w:val="20"/>
                 <w:szCs w:val="20"/>
               </w:rPr>
-              <w:t xml:space="preserve">SD Item / Material</w:t>
+              <w:t xml:space="preserve">Net Value X / Y / delta</w:t>
             </w:r>
           </w:p>
         </w:tc>
@@ -951,7 +951,7 @@
                 <w:sz w:val="20"/>
                 <w:szCs w:val="20"/>
               </w:rPr>
-              <w:t xml:space="preserve">Order item and material being compared</w:t>
+              <w:t xml:space="preserve">Order net value of the old vs. new order and the difference — a delta of zero is the strongest single indicator that pricing matches</w:t>
             </w:r>
           </w:p>
         </w:tc>
@@ -976,7 +976,7 @@
                 <w:sz w:val="20"/>
                 <w:szCs w:val="20"/>
               </w:rPr>
-              <w:t xml:space="preserve">Cond. Type</w:t>
+              <w:t xml:space="preserve">Checks / OK / Differences / Warnings</w:t>
             </w:r>
           </w:p>
         </w:tc>
@@ -999,7 +999,7 @@
                 <w:sz w:val="20"/>
                 <w:szCs w:val="20"/>
               </w:rPr>
-              <w:t xml:space="preserve">Pricing condition type (price, discount, tax…). The row *NET compares the item net value.</w:t>
+              <w:t xml:space="preserve">How many individual comparisons were made for this order and how they turned out</w:t>
             </w:r>
           </w:p>
         </w:tc>
@@ -1024,7 +1024,7 @@
                 <w:sz w:val="20"/>
                 <w:szCs w:val="20"/>
               </w:rPr>
-              <w:t xml:space="preserve">Rate X / Rate Y / Rate delta</w:t>
+              <w:t xml:space="preserve">Result</w:t>
             </w:r>
           </w:p>
         </w:tc>
@@ -1047,103 +1047,7 @@
                 <w:sz w:val="20"/>
                 <w:szCs w:val="20"/>
               </w:rPr>
-              <w:t xml:space="preserve">Condition rate in the old vs. new order, and the difference</w:t>
-            </w:r>
-          </w:p>
-        </w:tc>
-      </w:tr>
-      <w:tr>
-        <w:tc>
-          <w:tcPr>
-            <w:tcW w:type="dxa" w:w="2400"/>
-            <w:tcMar>
-              <w:top w:type="dxa" w:w="60"/>
-              <w:left w:type="dxa" w:w="100"/>
-              <w:bottom w:type="dxa" w:w="60"/>
-              <w:right w:type="dxa" w:w="100"/>
-            </w:tcMar>
-          </w:tcPr>
-          <w:p>
-            <w:pPr>
-              <w:spacing w:after="0"/>
-            </w:pPr>
-            <w:r>
-              <w:rPr>
-                <w:sz w:val="20"/>
-                <w:szCs w:val="20"/>
-              </w:rPr>
-              <w:t xml:space="preserve">Value X / Value Y / Value delta</w:t>
-            </w:r>
-          </w:p>
-        </w:tc>
-        <w:tc>
-          <w:tcPr>
-            <w:tcW w:type="dxa" w:w="4600"/>
-            <w:tcMar>
-              <w:top w:type="dxa" w:w="60"/>
-              <w:left w:type="dxa" w:w="100"/>
-              <w:bottom w:type="dxa" w:w="60"/>
-              <w:right w:type="dxa" w:w="100"/>
-            </w:tcMar>
-          </w:tcPr>
-          <w:p>
-            <w:pPr>
-              <w:spacing w:after="0"/>
-            </w:pPr>
-            <w:r>
-              <w:rPr>
-                <w:sz w:val="20"/>
-                <w:szCs w:val="20"/>
-              </w:rPr>
-              <w:t xml:space="preserve">Condition value in the old vs. new order, and the difference</w:t>
-            </w:r>
-          </w:p>
-        </w:tc>
-      </w:tr>
-      <w:tr>
-        <w:tc>
-          <w:tcPr>
-            <w:tcW w:type="dxa" w:w="2400"/>
-            <w:tcMar>
-              <w:top w:type="dxa" w:w="60"/>
-              <w:left w:type="dxa" w:w="100"/>
-              <w:bottom w:type="dxa" w:w="60"/>
-              <w:right w:type="dxa" w:w="100"/>
-            </w:tcMar>
-          </w:tcPr>
-          <w:p>
-            <w:pPr>
-              <w:spacing w:after="0"/>
-            </w:pPr>
-            <w:r>
-              <w:rPr>
-                <w:sz w:val="20"/>
-                <w:szCs w:val="20"/>
-              </w:rPr>
-              <w:t xml:space="preserve">Remark</w:t>
-            </w:r>
-          </w:p>
-        </w:tc>
-        <w:tc>
-          <w:tcPr>
-            <w:tcW w:type="dxa" w:w="4600"/>
-            <w:tcMar>
-              <w:top w:type="dxa" w:w="60"/>
-              <w:left w:type="dxa" w:w="100"/>
-              <w:bottom w:type="dxa" w:w="60"/>
-              <w:right w:type="dxa" w:w="100"/>
-            </w:tcMar>
-          </w:tcPr>
-          <w:p>
-            <w:pPr>
-              <w:spacing w:after="0"/>
-            </w:pPr>
-            <w:r>
-              <w:rPr>
-                <w:sz w:val="20"/>
-                <w:szCs w:val="20"/>
-              </w:rPr>
-              <w:t xml:space="preserve">Explanation of the status, including any SAP error messages</w:t>
+              <w:t xml:space="preserve">ALL OK (green) = pricing matches · CHECK (red) = real differences, open the detail · ERROR (red) = copy could not be created</w:t>
             </w:r>
           </w:p>
         </w:tc>
@@ -1162,7 +1066,442 @@
           <w:sz w:val="24"/>
           <w:szCs w:val="24"/>
         </w:rPr>
-        <w:t xml:space="preserve">4.2 Status and colors</w:t>
+        <w:t xml:space="preserve">4.2 Screen 2 — Pricing detail (click an order number)</w:t>
+      </w:r>
+    </w:p>
+    <w:p>
+      <w:pPr>
+        <w:spacing w:after="120"/>
+      </w:pPr>
+      <w:r>
+        <w:rPr>
+          <w:sz w:val="22"/>
+          <w:szCs w:val="22"/>
+        </w:rPr>
+        <w:t xml:space="preserve">The detail opens as a popup and is sorted in reading order: first the order total, then the value fields of every item, then the pricing conditions of every item.</w:t>
+      </w:r>
+    </w:p>
+    <w:tbl>
+      <w:tblPr>
+        <w:tblW w:type="dxa" w:w="7000"/>
+        <w:tblBorders>
+          <w:top w:val="single" w:color="auto" w:sz="4"/>
+          <w:left w:val="single" w:color="auto" w:sz="4"/>
+          <w:bottom w:val="single" w:color="auto" w:sz="4"/>
+          <w:right w:val="single" w:color="auto" w:sz="4"/>
+          <w:insideH w:val="single" w:color="auto" w:sz="4"/>
+          <w:insideV w:val="single" w:color="auto" w:sz="4"/>
+        </w:tblBorders>
+      </w:tblPr>
+      <w:tblGrid>
+        <w:gridCol w:w="2400"/>
+        <w:gridCol w:w="4600"/>
+      </w:tblGrid>
+      <w:tr>
+        <w:tc>
+          <w:tcPr>
+            <w:tcW w:type="dxa" w:w="2400"/>
+            <w:shd w:fill="F2F2F2" w:val="clear"/>
+            <w:tcMar>
+              <w:top w:type="dxa" w:w="60"/>
+              <w:left w:type="dxa" w:w="100"/>
+              <w:bottom w:type="dxa" w:w="60"/>
+              <w:right w:type="dxa" w:w="100"/>
+            </w:tcMar>
+          </w:tcPr>
+          <w:p>
+            <w:pPr>
+              <w:spacing w:after="0"/>
+            </w:pPr>
+            <w:r>
+              <w:rPr>
+                <w:b/>
+                <w:bCs/>
+                <w:sz w:val="20"/>
+                <w:szCs w:val="20"/>
+              </w:rPr>
+              <w:t xml:space="preserve">Column</w:t>
+            </w:r>
+          </w:p>
+        </w:tc>
+        <w:tc>
+          <w:tcPr>
+            <w:tcW w:type="dxa" w:w="4600"/>
+            <w:shd w:fill="F2F2F2" w:val="clear"/>
+            <w:tcMar>
+              <w:top w:type="dxa" w:w="60"/>
+              <w:left w:type="dxa" w:w="100"/>
+              <w:bottom w:type="dxa" w:w="60"/>
+              <w:right w:type="dxa" w:w="100"/>
+            </w:tcMar>
+          </w:tcPr>
+          <w:p>
+            <w:pPr>
+              <w:spacing w:after="0"/>
+            </w:pPr>
+            <w:r>
+              <w:rPr>
+                <w:b/>
+                <w:bCs/>
+                <w:sz w:val="20"/>
+                <w:szCs w:val="20"/>
+              </w:rPr>
+              <w:t xml:space="preserve">Meaning</w:t>
+            </w:r>
+          </w:p>
+        </w:tc>
+      </w:tr>
+      <w:tr>
+        <w:tc>
+          <w:tcPr>
+            <w:tcW w:type="dxa" w:w="2400"/>
+            <w:tcMar>
+              <w:top w:type="dxa" w:w="60"/>
+              <w:left w:type="dxa" w:w="100"/>
+              <w:bottom w:type="dxa" w:w="60"/>
+              <w:right w:type="dxa" w:w="100"/>
+            </w:tcMar>
+          </w:tcPr>
+          <w:p>
+            <w:pPr>
+              <w:spacing w:after="0"/>
+            </w:pPr>
+            <w:r>
+              <w:rPr>
+                <w:sz w:val="20"/>
+                <w:szCs w:val="20"/>
+              </w:rPr>
+              <w:t xml:space="preserve">Section</w:t>
+            </w:r>
+          </w:p>
+        </w:tc>
+        <w:tc>
+          <w:tcPr>
+            <w:tcW w:type="dxa" w:w="4600"/>
+            <w:tcMar>
+              <w:top w:type="dxa" w:w="60"/>
+              <w:left w:type="dxa" w:w="100"/>
+              <w:bottom w:type="dxa" w:w="60"/>
+              <w:right w:type="dxa" w:w="100"/>
+            </w:tcMar>
+          </w:tcPr>
+          <w:p>
+            <w:pPr>
+              <w:spacing w:after="0"/>
+            </w:pPr>
+            <w:r>
+              <w:rPr>
+                <w:sz w:val="20"/>
+                <w:szCs w:val="20"/>
+              </w:rPr>
+              <w:t xml:space="preserve">What kind of check the row is: Order total → Item values → Pricing condition</w:t>
+            </w:r>
+          </w:p>
+        </w:tc>
+      </w:tr>
+      <w:tr>
+        <w:tc>
+          <w:tcPr>
+            <w:tcW w:type="dxa" w:w="2400"/>
+            <w:tcMar>
+              <w:top w:type="dxa" w:w="60"/>
+              <w:left w:type="dxa" w:w="100"/>
+              <w:bottom w:type="dxa" w:w="60"/>
+              <w:right w:type="dxa" w:w="100"/>
+            </w:tcMar>
+          </w:tcPr>
+          <w:p>
+            <w:pPr>
+              <w:spacing w:after="0"/>
+            </w:pPr>
+            <w:r>
+              <w:rPr>
+                <w:sz w:val="20"/>
+                <w:szCs w:val="20"/>
+              </w:rPr>
+              <w:t xml:space="preserve">Condition/Field</w:t>
+            </w:r>
+          </w:p>
+        </w:tc>
+        <w:tc>
+          <w:tcPr>
+            <w:tcW w:type="dxa" w:w="4600"/>
+            <w:tcMar>
+              <w:top w:type="dxa" w:w="60"/>
+              <w:left w:type="dxa" w:w="100"/>
+              <w:bottom w:type="dxa" w:w="60"/>
+              <w:right w:type="dxa" w:w="100"/>
+            </w:tcMar>
+          </w:tcPr>
+          <w:p>
+            <w:pPr>
+              <w:spacing w:after="0"/>
+            </w:pPr>
+            <w:r>
+              <w:rPr>
+                <w:sz w:val="20"/>
+                <w:szCs w:val="20"/>
+              </w:rPr>
+              <w:t xml:space="preserve">The pricing condition type (e.g. MWST, YJR0) or the compared value field (e.g. NETWR, KZWI3). Double-click a condition row to open its condition record (VK13).</w:t>
+            </w:r>
+          </w:p>
+        </w:tc>
+      </w:tr>
+      <w:tr>
+        <w:tc>
+          <w:tcPr>
+            <w:tcW w:type="dxa" w:w="2400"/>
+            <w:tcMar>
+              <w:top w:type="dxa" w:w="60"/>
+              <w:left w:type="dxa" w:w="100"/>
+              <w:bottom w:type="dxa" w:w="60"/>
+              <w:right w:type="dxa" w:w="100"/>
+            </w:tcMar>
+          </w:tcPr>
+          <w:p>
+            <w:pPr>
+              <w:spacing w:after="0"/>
+            </w:pPr>
+            <w:r>
+              <w:rPr>
+                <w:sz w:val="20"/>
+                <w:szCs w:val="20"/>
+              </w:rPr>
+              <w:t xml:space="preserve">Description</w:t>
+            </w:r>
+          </w:p>
+        </w:tc>
+        <w:tc>
+          <w:tcPr>
+            <w:tcW w:type="dxa" w:w="4600"/>
+            <w:tcMar>
+              <w:top w:type="dxa" w:w="60"/>
+              <w:left w:type="dxa" w:w="100"/>
+              <w:bottom w:type="dxa" w:w="60"/>
+              <w:right w:type="dxa" w:w="100"/>
+            </w:tcMar>
+          </w:tcPr>
+          <w:p>
+            <w:pPr>
+              <w:spacing w:after="0"/>
+            </w:pPr>
+            <w:r>
+              <w:rPr>
+                <w:sz w:val="20"/>
+                <w:szCs w:val="20"/>
+              </w:rPr>
+              <w:t xml:space="preserve">Plain-language meaning of the row, e.g. "Output Tax", "Item net value", "Pricing subtotal 3", "Cost (moving average price)"</w:t>
+            </w:r>
+          </w:p>
+        </w:tc>
+      </w:tr>
+      <w:tr>
+        <w:tc>
+          <w:tcPr>
+            <w:tcW w:type="dxa" w:w="2400"/>
+            <w:tcMar>
+              <w:top w:type="dxa" w:w="60"/>
+              <w:left w:type="dxa" w:w="100"/>
+              <w:bottom w:type="dxa" w:w="60"/>
+              <w:right w:type="dxa" w:w="100"/>
+            </w:tcMar>
+          </w:tcPr>
+          <w:p>
+            <w:pPr>
+              <w:spacing w:after="0"/>
+            </w:pPr>
+            <w:r>
+              <w:rPr>
+                <w:sz w:val="20"/>
+                <w:szCs w:val="20"/>
+              </w:rPr>
+              <w:t xml:space="preserve">Rate X / Y / delta</w:t>
+            </w:r>
+          </w:p>
+        </w:tc>
+        <w:tc>
+          <w:tcPr>
+            <w:tcW w:type="dxa" w:w="4600"/>
+            <w:tcMar>
+              <w:top w:type="dxa" w:w="60"/>
+              <w:left w:type="dxa" w:w="100"/>
+              <w:bottom w:type="dxa" w:w="60"/>
+              <w:right w:type="dxa" w:w="100"/>
+            </w:tcMar>
+          </w:tcPr>
+          <w:p>
+            <w:pPr>
+              <w:spacing w:after="0"/>
+            </w:pPr>
+            <w:r>
+              <w:rPr>
+                <w:sz w:val="20"/>
+                <w:szCs w:val="20"/>
+              </w:rPr>
+              <w:t xml:space="preserve">Condition rate (percentage or price per unit) — filled for pricing conditions only</w:t>
+            </w:r>
+          </w:p>
+        </w:tc>
+      </w:tr>
+      <w:tr>
+        <w:tc>
+          <w:tcPr>
+            <w:tcW w:type="dxa" w:w="2400"/>
+            <w:tcMar>
+              <w:top w:type="dxa" w:w="60"/>
+              <w:left w:type="dxa" w:w="100"/>
+              <w:bottom w:type="dxa" w:w="60"/>
+              <w:right w:type="dxa" w:w="100"/>
+            </w:tcMar>
+          </w:tcPr>
+          <w:p>
+            <w:pPr>
+              <w:spacing w:after="0"/>
+            </w:pPr>
+            <w:r>
+              <w:rPr>
+                <w:sz w:val="20"/>
+                <w:szCs w:val="20"/>
+              </w:rPr>
+              <w:t xml:space="preserve">Amount X / Y / delta</w:t>
+            </w:r>
+          </w:p>
+        </w:tc>
+        <w:tc>
+          <w:tcPr>
+            <w:tcW w:type="dxa" w:w="4600"/>
+            <w:tcMar>
+              <w:top w:type="dxa" w:w="60"/>
+              <w:left w:type="dxa" w:w="100"/>
+              <w:bottom w:type="dxa" w:w="60"/>
+              <w:right w:type="dxa" w:w="100"/>
+            </w:tcMar>
+          </w:tcPr>
+          <w:p>
+            <w:pPr>
+              <w:spacing w:after="0"/>
+            </w:pPr>
+            <w:r>
+              <w:rPr>
+                <w:sz w:val="20"/>
+                <w:szCs w:val="20"/>
+              </w:rPr>
+              <w:t xml:space="preserve">Money value in document currency — condition values and item/header value fields</w:t>
+            </w:r>
+          </w:p>
+        </w:tc>
+      </w:tr>
+      <w:tr>
+        <w:tc>
+          <w:tcPr>
+            <w:tcW w:type="dxa" w:w="2400"/>
+            <w:tcMar>
+              <w:top w:type="dxa" w:w="60"/>
+              <w:left w:type="dxa" w:w="100"/>
+              <w:bottom w:type="dxa" w:w="60"/>
+              <w:right w:type="dxa" w:w="100"/>
+            </w:tcMar>
+          </w:tcPr>
+          <w:p>
+            <w:pPr>
+              <w:spacing w:after="0"/>
+            </w:pPr>
+            <w:r>
+              <w:rPr>
+                <w:sz w:val="20"/>
+                <w:szCs w:val="20"/>
+              </w:rPr>
+              <w:t xml:space="preserve">Pricing date</w:t>
+            </w:r>
+          </w:p>
+        </w:tc>
+        <w:tc>
+          <w:tcPr>
+            <w:tcW w:type="dxa" w:w="4600"/>
+            <w:tcMar>
+              <w:top w:type="dxa" w:w="60"/>
+              <w:left w:type="dxa" w:w="100"/>
+              <w:bottom w:type="dxa" w:w="60"/>
+              <w:right w:type="dxa" w:w="100"/>
+            </w:tcMar>
+          </w:tcPr>
+          <w:p>
+            <w:pPr>
+              <w:spacing w:after="0"/>
+            </w:pPr>
+            <w:r>
+              <w:rPr>
+                <w:sz w:val="20"/>
+                <w:szCs w:val="20"/>
+              </w:rPr>
+              <w:t xml:space="preserve">The date the copy was priced on (= the original order’s pricing date). Use it when checking condition records in VK13.</w:t>
+            </w:r>
+          </w:p>
+        </w:tc>
+      </w:tr>
+      <w:tr>
+        <w:tc>
+          <w:tcPr>
+            <w:tcW w:type="dxa" w:w="2400"/>
+            <w:tcMar>
+              <w:top w:type="dxa" w:w="60"/>
+              <w:left w:type="dxa" w:w="100"/>
+              <w:bottom w:type="dxa" w:w="60"/>
+              <w:right w:type="dxa" w:w="100"/>
+            </w:tcMar>
+          </w:tcPr>
+          <w:p>
+            <w:pPr>
+              <w:spacing w:after="0"/>
+            </w:pPr>
+            <w:r>
+              <w:rPr>
+                <w:sz w:val="20"/>
+                <w:szCs w:val="20"/>
+              </w:rPr>
+              <w:t xml:space="preserve">Remark</w:t>
+            </w:r>
+          </w:p>
+        </w:tc>
+        <w:tc>
+          <w:tcPr>
+            <w:tcW w:type="dxa" w:w="4600"/>
+            <w:tcMar>
+              <w:top w:type="dxa" w:w="60"/>
+              <w:left w:type="dxa" w:w="100"/>
+              <w:bottom w:type="dxa" w:w="60"/>
+              <w:right w:type="dxa" w:w="100"/>
+            </w:tcMar>
+          </w:tcPr>
+          <w:p>
+            <w:pPr>
+              <w:spacing w:after="0"/>
+            </w:pPr>
+            <w:r>
+              <w:rPr>
+                <w:sz w:val="20"/>
+                <w:szCs w:val="20"/>
+              </w:rPr>
+              <w:t xml:space="preserve">Explanation of the status, including any SAP messages</w:t>
+            </w:r>
+          </w:p>
+        </w:tc>
+      </w:tr>
+    </w:tbl>
+    <w:p>
+      <w:pPr>
+        <w:pStyle w:val="Heading2"/>
+        <w:spacing w:after="120" w:before="240"/>
+      </w:pPr>
+      <w:r>
+        <w:rPr>
+          <w:b/>
+          <w:bCs/>
+          <w:color w:val="333333"/>
+          <w:sz w:val="24"/>
+          <w:szCs w:val="24"/>
+        </w:rPr>
+        <w:t xml:space="preserve">4.3 Status and colors</w:t>
       </w:r>
     </w:p>
     <w:tbl>
@@ -1902,7 +2241,7 @@
           <w:sz w:val="22"/>
           <w:szCs w:val="22"/>
         </w:rPr>
-        <w:t xml:space="preserve">compare the condition record behind the condition type (transaction VK13) valid on the order’s pricing date with the value in the old order; check calculation type, scales and currency decimals.</w:t>
+        <w:t xml:space="preserve">double-click the red condition row — the program opens the condition record display (VK13) for that condition type. Check the record valid on the pricing date shown in the row: calculation type, scales and currency decimals.</w:t>
       </w:r>
     </w:p>
     <w:p>

</xml_diff>